<commit_message>
Update Completion Matrix with fixed risk-prediction and resources status
</commit_message>
<xml_diff>
--- a/Completion Matrix.docx
+++ b/Completion Matrix.docx
@@ -655,9 +655,9 @@
               <w:rPr>
                 <w:b/>
                 <w:bCs/>
-                <w:color w:val="B8860B"/>
-              </w:rPr>
-              <w:t xml:space="preserve">⚠ Prototype (High-fidelity)</w:t>
+                <w:color w:val="1E7C34"/>
+              </w:rPr>
+              <w:t xml:space="preserve">✔ Fully implemented</w:t>
             </w:r>
           </w:p>
         </w:tc>
@@ -681,7 +681,7 @@
                 <w:b w:val="false"/>
                 <w:bCs w:val="false"/>
               </w:rPr>
-              <w:t xml:space="preserve">UI displays a static risk score. Backend endpoint GET /api/ai/risk/:studentId already calculates risk dynamically (overdue tasks + study hours + weakest subject) but is not yet called from this page.</w:t>
+              <w:t xml:space="preserve">Wired to GET /api/ai/risk/:studentId (dynamic score from overdue tasks + study hours + weakest subject) and GET /api/analytics/subject-progress/:studentId for the per-subject breakdown. Falls back to demo data with a warning toast if the server is unreachable.</w:t>
             </w:r>
           </w:p>
         </w:tc>
@@ -802,9 +802,9 @@
               <w:rPr>
                 <w:b/>
                 <w:bCs/>
-                <w:color w:val="B8860B"/>
-              </w:rPr>
-              <w:t xml:space="preserve">⚠ Prototype (High-fidelity)</w:t>
+                <w:color w:val="1E7C34"/>
+              </w:rPr>
+              <w:t xml:space="preserve">✔ Fully implemented</w:t>
             </w:r>
           </w:p>
         </w:tc>
@@ -828,7 +828,7 @@
                 <w:b w:val="false"/>
                 <w:bCs w:val="false"/>
               </w:rPr>
-              <w:t xml:space="preserve">Resource list and type filters (notes/video/practice/weak) work client-side. Backend endpoint GET /api/ai/resources/:studentId exists but is not yet called from this page.</w:t>
+              <w:t xml:space="preserve">Wired to GET /api/ai/resources/:studentId; resource cards are rendered from live DB data, type filters still work client-side. Falls back to demo resources with a warning toast if the server is unreachable.</w:t>
             </w:r>
           </w:p>
         </w:tc>
@@ -1748,9 +1748,9 @@
               <w:rPr>
                 <w:b/>
                 <w:bCs/>
-                <w:color w:val="B00020"/>
-              </w:rPr>
-              <w:t xml:space="preserve">✖ Not Complete</w:t>
+                <w:color w:val="B8860B"/>
+              </w:rPr>
+              <w:t xml:space="preserve">⚠ Prototype (Backend-ready)</w:t>
             </w:r>
           </w:p>
         </w:tc>
@@ -1774,7 +1774,7 @@
                 <w:b w:val="false"/>
                 <w:bCs w:val="false"/>
               </w:rPr>
-              <w:t xml:space="preserve">Backend endpoint PUT /api/users/:userId is implemented, but no frontend form currently calls it</w:t>
+              <w:t xml:space="preserve">Backend endpoint PUT /api/users/:userId now works correctly (fixed a missing UserModel.update method that previously caused a 500 error), but no frontend form currently calls it</w:t>
             </w:r>
           </w:p>
         </w:tc>

</xml_diff>